<commit_message>
Updated resume baseline and added LinkedIn support.
</commit_message>
<xml_diff>
--- a/job-application-helper/assets/Jason_J_Garcia-RESUME.docx
+++ b/job-application-helper/assets/Jason_J_Garcia-RESUME.docx
@@ -100,7 +100,7 @@
           <w:szCs w:val="21"/>
           <w:rtl w:val="0"/>
         </w:rPr>
-        <w:t xml:space="preserve"> [Phone </w:t>
+        <w:t xml:space="preserve"> [Phone] </w:t>
       </w:r>
       <w:r>
         <w:rPr>
@@ -120,12 +120,7 @@
           <w:szCs w:val="21"/>
           <w:rtl w:val="0"/>
         </w:rPr>
-        <w:t xml:space="preserve"> [Email] </w:t>
-      </w:r>
-      <w:r>
-        <w:rPr>
-          <w:rtl w:val="0"/>
-        </w:rPr>
+        <w:t xml:space="preserve"> [Email]</w:t>
       </w:r>
     </w:p>
     <w:p>
@@ -171,76 +166,179 @@
     <w:p>
       <w:pPr>
         <w:widowControl w:val="0"/>
-        <w:spacing w:line="240" w:lineRule="auto"/>
         <w:ind w:left="-360" w:right="-360" w:firstLine="0"/>
         <w:jc w:val="center"/>
         <w:rPr>
           <w:rFonts w:ascii="Calibri" w:cs="Calibri" w:eastAsia="Calibri" w:hAnsi="Calibri"/>
           <w:b w:val="1"/>
           <w:bCs w:val="1"/>
-        </w:rPr>
-      </w:pPr>
-      <w:r>
-        <w:rPr>
-          <w:rFonts w:ascii="Calibri" w:cs="Calibri" w:eastAsia="Calibri" w:hAnsi="Calibri"/>
-          <w:b w:val="1"/>
-          <w:bCs w:val="1"/>
-          <w:rtl w:val="0"/>
-        </w:rPr>
-        <w:t xml:space="preserve">Technical Program Manager with 10+ years leading cross-functional programs across cutting-edge consumer tech and complex aerospace systems</w:t>
-      </w:r>
-    </w:p>
-    <w:p>
-      <w:pPr>
-        <w:widowControl w:val="0"/>
-        <w:spacing w:line="240" w:lineRule="auto"/>
+          <w:sz w:val="21"/>
+          <w:szCs w:val="21"/>
+        </w:rPr>
+      </w:pPr>
+      <w:r>
+        <w:rPr>
+          <w:rFonts w:ascii="Calibri" w:cs="Calibri" w:eastAsia="Calibri" w:hAnsi="Calibri"/>
+          <w:b w:val="1"/>
+          <w:bCs w:val="1"/>
+          <w:sz w:val="26"/>
+          <w:szCs w:val="26"/>
+          <w:rtl w:val="0"/>
+        </w:rPr>
+        <w:t xml:space="preserve">Senior Technical Program Manager</w:t>
+      </w:r>
+      <w:r>
+        <w:rPr>
+          <w:rtl w:val="0"/>
+        </w:rPr>
+      </w:r>
+    </w:p>
+    <w:p>
+      <w:pPr>
+        <w:widowControl w:val="0"/>
+        <w:spacing w:line="228" w:lineRule="auto"/>
+        <w:ind w:left="-360" w:right="-360" w:firstLine="0"/>
+        <w:jc w:val="both"/>
+        <w:rPr>
+          <w:rFonts w:ascii="Calibri" w:cs="Calibri" w:eastAsia="Calibri" w:hAnsi="Calibri"/>
+        </w:rPr>
+      </w:pPr>
+      <w:r>
+        <w:rPr>
+          <w:rFonts w:ascii="Calibri" w:cs="Calibri" w:eastAsia="Calibri" w:hAnsi="Calibri"/>
+          <w:rtl w:val="0"/>
+        </w:rPr>
+        <w:t xml:space="preserve">Solutions-oriented Technical Program Manager with 10+ years experience leading cross-functional teams to deliver large-scale systems from concept to production across cutting-edge consumer technology and complex aerospace environments. Expert in driving process optimization, implementing scalable AI solutions, and enabling data-driven decision-making, while managing multi-million-dollar budgets and aligning executive stakeholders to strategic objectives. Recognized for delivering high-impact programs that balance innovation, operational efficiency, and business value while navigating complexity and ambiguity.</w:t>
+      </w:r>
+    </w:p>
+    <w:p>
+      <w:pPr>
+        <w:widowControl w:val="0"/>
+        <w:spacing w:line="228" w:lineRule="auto"/>
+        <w:ind w:left="-360" w:right="-360" w:firstLine="0"/>
+        <w:jc w:val="both"/>
+        <w:rPr>
+          <w:rFonts w:ascii="Calibri" w:cs="Calibri" w:eastAsia="Calibri" w:hAnsi="Calibri"/>
+        </w:rPr>
+      </w:pPr>
+      <w:r>
+        <w:rPr>
+          <w:rtl w:val="0"/>
+        </w:rPr>
+      </w:r>
+    </w:p>
+    <w:p>
+      <w:pPr>
+        <w:widowControl w:val="0"/>
+        <w:spacing w:line="276" w:lineRule="auto"/>
         <w:ind w:left="-360" w:right="-360" w:firstLine="0"/>
         <w:jc w:val="center"/>
         <w:rPr>
           <w:rFonts w:ascii="Calibri" w:cs="Calibri" w:eastAsia="Calibri" w:hAnsi="Calibri"/>
-          <w:b w:val="1"/>
-          <w:bCs w:val="1"/>
-          <w:sz w:val="16"/>
-          <w:szCs w:val="16"/>
-        </w:rPr>
-      </w:pPr>
-      <w:r>
-        <w:rPr>
-          <w:rtl w:val="0"/>
-        </w:rPr>
-      </w:r>
-    </w:p>
-    <w:p>
-      <w:pPr>
-        <w:widowControl w:val="0"/>
-        <w:spacing w:line="228" w:lineRule="auto"/>
-        <w:ind w:left="-360" w:right="-360" w:firstLine="0"/>
-        <w:jc w:val="both"/>
-        <w:rPr>
-          <w:rFonts w:ascii="Calibri" w:cs="Calibri" w:eastAsia="Calibri" w:hAnsi="Calibri"/>
-        </w:rPr>
-      </w:pPr>
-      <w:r>
-        <w:rPr>
-          <w:rFonts w:ascii="Calibri" w:cs="Calibri" w:eastAsia="Calibri" w:hAnsi="Calibri"/>
-          <w:rtl w:val="0"/>
-        </w:rPr>
-        <w:t xml:space="preserve">Expert in cross-functional leadership across multi-disciplinary teams, managing multi-million dollar budgets, and delivering large-scale systems from concept to production.</w:t>
-      </w:r>
-      <w:r>
-        <w:rPr>
-          <w:rFonts w:ascii="Calibri" w:cs="Calibri" w:eastAsia="Calibri" w:hAnsi="Calibri"/>
-          <w:rtl w:val="0"/>
-        </w:rPr>
-        <w:t xml:space="preserve"> Highly focused on process optimization through data-driven decision making and leveraging technology and AI to deliver scalable solutions. Adept at managing complex programs, alignment across functions, and communicating effectively with executive stakeholders.</w:t>
-      </w:r>
-    </w:p>
-    <w:p>
-      <w:pPr>
-        <w:widowControl w:val="0"/>
-        <w:spacing w:line="228" w:lineRule="auto"/>
-        <w:ind w:left="-360" w:right="-360" w:firstLine="0"/>
-        <w:jc w:val="both"/>
+        </w:rPr>
+      </w:pPr>
+      <w:r>
+        <w:rPr>
+          <w:rFonts w:ascii="Calibri" w:cs="Calibri" w:eastAsia="Calibri" w:hAnsi="Calibri"/>
+          <w:b w:val="1"/>
+          <w:bCs w:val="1"/>
+          <w:sz w:val="26"/>
+          <w:szCs w:val="26"/>
+          <w:rtl w:val="0"/>
+        </w:rPr>
+        <w:t xml:space="preserve">Areas of Expertise</w:t>
+      </w:r>
+      <w:r>
+        <w:rPr>
+          <w:rtl w:val="0"/>
+        </w:rPr>
+      </w:r>
+    </w:p>
+    <w:p>
+      <w:pPr>
+        <w:widowControl w:val="0"/>
+        <w:spacing w:line="229" w:lineRule="auto"/>
+        <w:ind w:left="-360" w:right="-360" w:firstLine="0"/>
+        <w:jc w:val="both"/>
+        <w:rPr>
+          <w:rFonts w:ascii="Calibri" w:cs="Calibri" w:eastAsia="Calibri" w:hAnsi="Calibri"/>
+        </w:rPr>
+      </w:pPr>
+      <w:r>
+        <w:rPr>
+          <w:rFonts w:ascii="Calibri" w:cs="Calibri" w:eastAsia="Calibri" w:hAnsi="Calibri"/>
+          <w:rtl w:val="0"/>
+        </w:rPr>
+        <w:t xml:space="preserve">Technical Program Manager | Strategic Planning &amp; Execution | Cross-Functional Leadership | Budget Planning &amp; Financial Strategy | Stakeholder Engagement | AR/VR &amp; Aerospace Systems | Data-Driven Decision Making | AI &amp; Data Analytics | Process Optimization | OKR/KPI Tracking | Agile Sprint Management | Team Leadership &amp; Development | Executive Communications</w:t>
+      </w:r>
+    </w:p>
+    <w:p>
+      <w:pPr>
+        <w:widowControl w:val="0"/>
+        <w:spacing w:line="229" w:lineRule="auto"/>
+        <w:ind w:left="-360" w:right="-360" w:firstLine="0"/>
+        <w:rPr>
+          <w:rFonts w:ascii="Calibri" w:cs="Calibri" w:eastAsia="Calibri" w:hAnsi="Calibri"/>
+        </w:rPr>
+      </w:pPr>
+      <w:r>
+        <w:rPr>
+          <w:rtl w:val="0"/>
+        </w:rPr>
+      </w:r>
+    </w:p>
+    <w:p>
+      <w:pPr>
+        <w:widowControl w:val="0"/>
+        <w:spacing w:line="276" w:lineRule="auto"/>
+        <w:ind w:left="-360" w:right="-360" w:firstLine="0"/>
+        <w:jc w:val="center"/>
+        <w:rPr>
+          <w:rFonts w:ascii="Calibri" w:cs="Calibri" w:eastAsia="Calibri" w:hAnsi="Calibri"/>
+          <w:sz w:val="26"/>
+          <w:szCs w:val="26"/>
+        </w:rPr>
+      </w:pPr>
+      <w:r>
+        <w:rPr>
+          <w:rFonts w:ascii="Calibri" w:cs="Calibri" w:eastAsia="Calibri" w:hAnsi="Calibri"/>
+          <w:b w:val="1"/>
+          <w:bCs w:val="1"/>
+          <w:sz w:val="26"/>
+          <w:szCs w:val="26"/>
+          <w:rtl w:val="0"/>
+        </w:rPr>
+        <w:t xml:space="preserve">Technical Skills</w:t>
+      </w:r>
+      <w:r>
+        <w:rPr>
+          <w:rtl w:val="0"/>
+        </w:rPr>
+      </w:r>
+    </w:p>
+    <w:p>
+      <w:pPr>
+        <w:widowControl w:val="0"/>
+        <w:spacing w:line="229" w:lineRule="auto"/>
+        <w:ind w:left="-360" w:right="-360" w:firstLine="0"/>
+        <w:jc w:val="both"/>
+        <w:rPr>
+          <w:rFonts w:ascii="Calibri" w:cs="Calibri" w:eastAsia="Calibri" w:hAnsi="Calibri"/>
+        </w:rPr>
+      </w:pPr>
+      <w:r>
+        <w:rPr>
+          <w:rFonts w:ascii="Calibri" w:cs="Calibri" w:eastAsia="Calibri" w:hAnsi="Calibri"/>
+          <w:rtl w:val="0"/>
+        </w:rPr>
+        <w:t xml:space="preserve">Google Workspace | Microsoft Office Suite | Asana | Airtable | Jira | AppScripts | Python | JavaScript/TypeScript | SQL | Markdown | HTML/CSS | AI Agent Workflows</w:t>
+      </w:r>
+    </w:p>
+    <w:p>
+      <w:pPr>
+        <w:widowControl w:val="0"/>
+        <w:spacing w:line="229" w:lineRule="auto"/>
+        <w:ind w:left="-360" w:right="-360" w:firstLine="0"/>
         <w:rPr>
           <w:rFonts w:ascii="Calibri" w:cs="Calibri" w:eastAsia="Calibri" w:hAnsi="Calibri"/>
         </w:rPr>
@@ -334,6 +432,11 @@
         </w:rPr>
         <w:t xml:space="preserve"> from ground up, managing 5 direct reports and up to 4 temporary reports (1 Program Manager, 4-8 Research Assistants) while establishing standardized operating procedures, knowledge repositories, and onboarding frameworks, improving dataset generation yields for ML models from 70% to &gt;90% pass rates (beating company-wide average by 10%)</w:t>
       </w:r>
+      <w:r>
+        <w:rPr>
+          <w:rtl w:val="0"/>
+        </w:rPr>
+      </w:r>
     </w:p>
     <w:p>
       <w:pPr>
@@ -372,44 +475,111 @@
     </w:p>
     <w:p>
       <w:pPr>
-        <w:widowControl w:val="0"/>
-        <w:spacing w:line="228" w:lineRule="auto"/>
-        <w:ind w:left="-360" w:right="-360" w:firstLine="0"/>
-        <w:jc w:val="both"/>
-        <w:rPr>
-          <w:rFonts w:ascii="Calibri" w:cs="Calibri" w:eastAsia="Calibri" w:hAnsi="Calibri"/>
-        </w:rPr>
-      </w:pPr>
-      <w:r>
-        <w:rPr>
-          <w:rtl w:val="0"/>
-        </w:rPr>
-      </w:r>
-    </w:p>
-    <w:p>
-      <w:pPr>
         <w:spacing w:line="276" w:lineRule="auto"/>
         <w:ind w:left="-360" w:right="-360" w:firstLine="0"/>
+        <w:rPr>
+          <w:rFonts w:ascii="Calibri" w:cs="Calibri" w:eastAsia="Calibri" w:hAnsi="Calibri"/>
+          <w:b w:val="1"/>
+          <w:bCs w:val="1"/>
+        </w:rPr>
+      </w:pPr>
+      <w:r>
+        <w:rPr>
+          <w:rtl w:val="0"/>
+        </w:rPr>
+      </w:r>
+    </w:p>
+    <w:p>
+      <w:pPr>
+        <w:spacing w:line="276" w:lineRule="auto"/>
+        <w:ind w:left="-360" w:right="-360" w:firstLine="0"/>
         <w:jc w:val="center"/>
-        <w:rPr>
-          <w:rFonts w:ascii="Calibri" w:cs="Calibri" w:eastAsia="Calibri" w:hAnsi="Calibri"/>
-        </w:rPr>
-      </w:pPr>
-      <w:r>
         <w:rPr>
           <w:rFonts w:ascii="Calibri" w:cs="Calibri" w:eastAsia="Calibri" w:hAnsi="Calibri"/>
           <w:b w:val="1"/>
           <w:bCs w:val="1"/>
           <w:sz w:val="26"/>
           <w:szCs w:val="26"/>
-          <w:rtl w:val="0"/>
-        </w:rPr>
-        <w:t xml:space="preserve">Technical Skills</w:t>
-      </w:r>
-      <w:r>
-        <w:rPr>
-          <w:rtl w:val="0"/>
-        </w:rPr>
+        </w:rPr>
+      </w:pPr>
+      <w:r>
+        <w:rPr>
+          <w:rFonts w:ascii="Calibri" w:cs="Calibri" w:eastAsia="Calibri" w:hAnsi="Calibri"/>
+          <w:b w:val="1"/>
+          <w:bCs w:val="1"/>
+          <w:sz w:val="26"/>
+          <w:szCs w:val="26"/>
+          <w:rtl w:val="0"/>
+        </w:rPr>
+        <w:t xml:space="preserve">Experience</w:t>
+      </w:r>
+    </w:p>
+    <w:p>
+      <w:pPr>
+        <w:widowControl w:val="0"/>
+        <w:tabs>
+          <w:tab w:val="right" w:leader="none" w:pos="9992"/>
+        </w:tabs>
+        <w:spacing w:line="229" w:lineRule="auto"/>
+        <w:ind w:left="-360" w:right="-360" w:firstLine="0"/>
+        <w:jc w:val="both"/>
+        <w:rPr>
+          <w:rFonts w:ascii="Calibri" w:cs="Calibri" w:eastAsia="Calibri" w:hAnsi="Calibri"/>
+          <w:b w:val="1"/>
+          <w:bCs w:val="1"/>
+        </w:rPr>
+      </w:pPr>
+      <w:r>
+        <w:rPr>
+          <w:rFonts w:ascii="Calibri" w:cs="Calibri" w:eastAsia="Calibri" w:hAnsi="Calibri"/>
+          <w:b w:val="1"/>
+          <w:bCs w:val="1"/>
+          <w:rtl w:val="0"/>
+        </w:rPr>
+        <w:t xml:space="preserve">Meta RL - Eye Tracking</w:t>
+        <w:tab/>
+      </w:r>
+      <w:r>
+        <w:rPr>
+          <w:rFonts w:ascii="Calibri" w:cs="Calibri" w:eastAsia="Calibri" w:hAnsi="Calibri"/>
+          <w:rtl w:val="0"/>
+        </w:rPr>
+        <w:t xml:space="preserve">Redmond, WA</w:t>
+      </w:r>
+      <w:r>
+        <w:rPr>
+          <w:rtl w:val="0"/>
+        </w:rPr>
+      </w:r>
+    </w:p>
+    <w:p>
+      <w:pPr>
+        <w:widowControl w:val="0"/>
+        <w:tabs>
+          <w:tab w:val="right" w:leader="none" w:pos="9992"/>
+        </w:tabs>
+        <w:spacing w:line="229" w:lineRule="auto"/>
+        <w:ind w:left="-360" w:right="-360" w:firstLine="0"/>
+        <w:jc w:val="both"/>
+        <w:rPr>
+          <w:rFonts w:ascii="Calibri" w:cs="Calibri" w:eastAsia="Calibri" w:hAnsi="Calibri"/>
+        </w:rPr>
+      </w:pPr>
+      <w:r>
+        <w:rPr>
+          <w:rFonts w:ascii="Calibri" w:cs="Calibri" w:eastAsia="Calibri" w:hAnsi="Calibri"/>
+          <w:u w:val="single"/>
+          <w:rtl w:val="0"/>
+        </w:rPr>
+        <w:t xml:space="preserve">Technical Program Manager</w:t>
+      </w:r>
+      <w:r>
+        <w:rPr>
+          <w:rFonts w:ascii="Calibri" w:cs="Calibri" w:eastAsia="Calibri" w:hAnsi="Calibri"/>
+          <w:rtl w:val="0"/>
+        </w:rPr>
+        <w:tab/>
+        <w:t xml:space="preserve">October 2023 - Present</w:t>
       </w:r>
     </w:p>
     <w:p>
@@ -419,27 +589,28 @@
           <w:ilvl w:val="0"/>
           <w:numId w:val="5"/>
         </w:numPr>
+        <w:tabs>
+          <w:tab w:val="right" w:leader="none" w:pos="9992"/>
+        </w:tabs>
         <w:spacing w:line="229" w:lineRule="auto"/>
         <w:ind w:left="0" w:right="-360" w:hanging="360"/>
-        <w:rPr>
-          <w:rFonts w:ascii="Calibri" w:cs="Calibri" w:eastAsia="Calibri" w:hAnsi="Calibri"/>
-        </w:rPr>
-      </w:pPr>
-      <w:r>
-        <w:rPr>
-          <w:rFonts w:ascii="Calibri" w:cs="Calibri" w:eastAsia="Calibri" w:hAnsi="Calibri"/>
-          <w:b w:val="1"/>
-          <w:bCs w:val="1"/>
-          <w:rtl w:val="0"/>
-        </w:rPr>
-        <w:t xml:space="preserve">Strategic Planning &amp; Execution</w:t>
-      </w:r>
-      <w:r>
-        <w:rPr>
-          <w:rFonts w:ascii="Calibri" w:cs="Calibri" w:eastAsia="Calibri" w:hAnsi="Calibri"/>
-          <w:rtl w:val="0"/>
-        </w:rPr>
-        <w:t xml:space="preserve">: Annual/quarterly planning, cross-functional alignment, execution cadence</w:t>
+        <w:jc w:val="both"/>
+        <w:rPr>
+          <w:rFonts w:ascii="Calibri" w:cs="Calibri" w:eastAsia="Calibri" w:hAnsi="Calibri"/>
+          <w:u w:val="none"/>
+        </w:rPr>
+      </w:pPr>
+      <w:r>
+        <w:rPr>
+          <w:rFonts w:ascii="Calibri" w:cs="Calibri" w:eastAsia="Calibri" w:hAnsi="Calibri"/>
+          <w:rtl w:val="0"/>
+        </w:rPr>
+        <w:t xml:space="preserve">Enhanced collaboration across SOW development and execution between BD, legal, internal technical DRIs, and external partners–improving SOW approval timelines from months to weeks</w:t>
+      </w:r>
+      <w:r>
+        <w:rPr>
+          <w:rtl w:val="0"/>
+        </w:rPr>
       </w:r>
     </w:p>
     <w:p>
@@ -449,27 +620,28 @@
           <w:ilvl w:val="0"/>
           <w:numId w:val="5"/>
         </w:numPr>
+        <w:tabs>
+          <w:tab w:val="right" w:leader="none" w:pos="9992"/>
+        </w:tabs>
         <w:spacing w:line="229" w:lineRule="auto"/>
         <w:ind w:left="0" w:right="-360" w:hanging="360"/>
-        <w:rPr>
-          <w:rFonts w:ascii="Calibri" w:cs="Calibri" w:eastAsia="Calibri" w:hAnsi="Calibri"/>
-        </w:rPr>
-      </w:pPr>
-      <w:r>
-        <w:rPr>
-          <w:rFonts w:ascii="Calibri" w:cs="Calibri" w:eastAsia="Calibri" w:hAnsi="Calibri"/>
-          <w:b w:val="1"/>
-          <w:bCs w:val="1"/>
-          <w:rtl w:val="0"/>
-        </w:rPr>
-        <w:t xml:space="preserve">Project Lifecycle Management</w:t>
-      </w:r>
-      <w:r>
-        <w:rPr>
-          <w:rFonts w:ascii="Calibri" w:cs="Calibri" w:eastAsia="Calibri" w:hAnsi="Calibri"/>
-          <w:rtl w:val="0"/>
-        </w:rPr>
-        <w:t xml:space="preserve">: OKR/KPI tracking, roadmapping, agile sprint management</w:t>
+        <w:jc w:val="both"/>
+        <w:rPr>
+          <w:rFonts w:ascii="Calibri" w:cs="Calibri" w:eastAsia="Calibri" w:hAnsi="Calibri"/>
+          <w:u w:val="none"/>
+        </w:rPr>
+      </w:pPr>
+      <w:r>
+        <w:rPr>
+          <w:rFonts w:ascii="Calibri" w:cs="Calibri" w:eastAsia="Calibri" w:hAnsi="Calibri"/>
+          <w:rtl w:val="0"/>
+        </w:rPr>
+        <w:t xml:space="preserve">Led strategic planning and execution for an average of 5-7 cross-functional programs annually, partnering with research, engineering, and operations to deliver on all fixed annual and quarterly priorities</w:t>
+      </w:r>
+      <w:r>
+        <w:rPr>
+          <w:rtl w:val="0"/>
+        </w:rPr>
       </w:r>
     </w:p>
     <w:p>
@@ -479,27 +651,28 @@
           <w:ilvl w:val="0"/>
           <w:numId w:val="5"/>
         </w:numPr>
+        <w:tabs>
+          <w:tab w:val="right" w:leader="none" w:pos="9992"/>
+        </w:tabs>
         <w:spacing w:line="229" w:lineRule="auto"/>
         <w:ind w:left="0" w:right="-360" w:hanging="360"/>
-        <w:rPr>
-          <w:rFonts w:ascii="Calibri" w:cs="Calibri" w:eastAsia="Calibri" w:hAnsi="Calibri"/>
-        </w:rPr>
-      </w:pPr>
-      <w:r>
-        <w:rPr>
-          <w:rFonts w:ascii="Calibri" w:cs="Calibri" w:eastAsia="Calibri" w:hAnsi="Calibri"/>
-          <w:b w:val="1"/>
-          <w:bCs w:val="1"/>
-          <w:rtl w:val="0"/>
-        </w:rPr>
-        <w:t xml:space="preserve">Budgeting &amp; Financial Management</w:t>
-      </w:r>
-      <w:r>
-        <w:rPr>
-          <w:rFonts w:ascii="Calibri" w:cs="Calibri" w:eastAsia="Calibri" w:hAnsi="Calibri"/>
-          <w:rtl w:val="0"/>
-        </w:rPr>
-        <w:t xml:space="preserve">: Multi-million dollar budget planning, financial strategy, cross-organizational resource allocation</w:t>
+        <w:jc w:val="both"/>
+        <w:rPr>
+          <w:rFonts w:ascii="Calibri" w:cs="Calibri" w:eastAsia="Calibri" w:hAnsi="Calibri"/>
+          <w:u w:val="none"/>
+        </w:rPr>
+      </w:pPr>
+      <w:r>
+        <w:rPr>
+          <w:rFonts w:ascii="Calibri" w:cs="Calibri" w:eastAsia="Calibri" w:hAnsi="Calibri"/>
+          <w:rtl w:val="0"/>
+        </w:rPr>
+        <w:t xml:space="preserve">Spearheaded the development and projection of multi-million dollar budgets for annual planning, coordinating financial strategy and resource allocation across more than a dozen teams</w:t>
+      </w:r>
+      <w:r>
+        <w:rPr>
+          <w:rtl w:val="0"/>
+        </w:rPr>
       </w:r>
     </w:p>
     <w:p>
@@ -509,8 +682,12 @@
           <w:ilvl w:val="0"/>
           <w:numId w:val="5"/>
         </w:numPr>
+        <w:tabs>
+          <w:tab w:val="right" w:leader="none" w:pos="9992"/>
+        </w:tabs>
         <w:spacing w:line="229" w:lineRule="auto"/>
         <w:ind w:left="0" w:right="-360" w:hanging="360"/>
+        <w:jc w:val="both"/>
         <w:rPr>
           <w:rFonts w:ascii="Calibri" w:cs="Calibri" w:eastAsia="Calibri" w:hAnsi="Calibri"/>
           <w:u w:val="none"/>
@@ -519,18 +696,14 @@
       <w:r>
         <w:rPr>
           <w:rFonts w:ascii="Calibri" w:cs="Calibri" w:eastAsia="Calibri" w:hAnsi="Calibri"/>
-          <w:b w:val="1"/>
-          <w:bCs w:val="1"/>
-          <w:rtl w:val="0"/>
-        </w:rPr>
-        <w:t xml:space="preserve">AI &amp; Data Analytics</w:t>
-      </w:r>
-      <w:r>
-        <w:rPr>
-          <w:rFonts w:ascii="Calibri" w:cs="Calibri" w:eastAsia="Calibri" w:hAnsi="Calibri"/>
-          <w:rtl w:val="0"/>
-        </w:rPr>
-        <w:t xml:space="preserve">: AI tool evaluation and deployment, AI-powered dashboard design, advanced analytics (Excel/Sheets/AI tools), data synthesis for executive decision-making, process automation</w:t>
+          <w:rtl w:val="0"/>
+        </w:rPr>
+        <w:t xml:space="preserve">Delivered VR/AR prototype systems through design/requirements definitions and development throughout operational capture sessions at scale with external participants (dataset generation &gt;1,000)</w:t>
+      </w:r>
+      <w:r>
+        <w:rPr>
+          <w:rtl w:val="0"/>
+        </w:rPr>
       </w:r>
     </w:p>
     <w:p>
@@ -540,27 +713,28 @@
           <w:ilvl w:val="0"/>
           <w:numId w:val="5"/>
         </w:numPr>
+        <w:tabs>
+          <w:tab w:val="right" w:leader="none" w:pos="9992"/>
+        </w:tabs>
         <w:spacing w:line="229" w:lineRule="auto"/>
         <w:ind w:left="0" w:right="-360" w:hanging="360"/>
-        <w:rPr>
-          <w:rFonts w:ascii="Calibri" w:cs="Calibri" w:eastAsia="Calibri" w:hAnsi="Calibri"/>
-        </w:rPr>
-      </w:pPr>
-      <w:r>
-        <w:rPr>
-          <w:rFonts w:ascii="Calibri" w:cs="Calibri" w:eastAsia="Calibri" w:hAnsi="Calibri"/>
-          <w:b w:val="1"/>
-          <w:bCs w:val="1"/>
-          <w:rtl w:val="0"/>
-        </w:rPr>
-        <w:t xml:space="preserve">Operational Excellence</w:t>
-      </w:r>
-      <w:r>
-        <w:rPr>
-          <w:rFonts w:ascii="Calibri" w:cs="Calibri" w:eastAsia="Calibri" w:hAnsi="Calibri"/>
-          <w:rtl w:val="0"/>
-        </w:rPr>
-        <w:t xml:space="preserve">: Process design and optimization, workflow automation, operational cadence</w:t>
+        <w:jc w:val="both"/>
+        <w:rPr>
+          <w:rFonts w:ascii="Calibri" w:cs="Calibri" w:eastAsia="Calibri" w:hAnsi="Calibri"/>
+          <w:u w:val="none"/>
+        </w:rPr>
+      </w:pPr>
+      <w:r>
+        <w:rPr>
+          <w:rFonts w:ascii="Calibri" w:cs="Calibri" w:eastAsia="Calibri" w:hAnsi="Calibri"/>
+          <w:rtl w:val="0"/>
+        </w:rPr>
+        <w:t xml:space="preserve">Managed a team of 5 direct reports and 4 floating reports (1 Human Studies Program Manager, 4-8 Research Assistants), overseeing resource allocation, onboarding, and professional development and improving team efficiency by &gt;20% by using automated and data-first approaches for individual coaching, identifying high-impact process improvement opportunities, and strategic resource allocations</w:t>
+      </w:r>
+      <w:r>
+        <w:rPr>
+          <w:rtl w:val="0"/>
+        </w:rPr>
       </w:r>
     </w:p>
     <w:p>
@@ -570,27 +744,28 @@
           <w:ilvl w:val="0"/>
           <w:numId w:val="5"/>
         </w:numPr>
+        <w:tabs>
+          <w:tab w:val="right" w:leader="none" w:pos="9992"/>
+        </w:tabs>
         <w:spacing w:line="229" w:lineRule="auto"/>
         <w:ind w:left="0" w:right="-360" w:hanging="360"/>
-        <w:rPr>
-          <w:rFonts w:ascii="Calibri" w:cs="Calibri" w:eastAsia="Calibri" w:hAnsi="Calibri"/>
-        </w:rPr>
-      </w:pPr>
-      <w:r>
-        <w:rPr>
-          <w:rFonts w:ascii="Calibri" w:cs="Calibri" w:eastAsia="Calibri" w:hAnsi="Calibri"/>
-          <w:b w:val="1"/>
-          <w:bCs w:val="1"/>
-          <w:rtl w:val="0"/>
-        </w:rPr>
-        <w:t xml:space="preserve">Communication &amp; Leadership</w:t>
-      </w:r>
-      <w:r>
-        <w:rPr>
-          <w:rFonts w:ascii="Calibri" w:cs="Calibri" w:eastAsia="Calibri" w:hAnsi="Calibri"/>
-          <w:rtl w:val="0"/>
-        </w:rPr>
-        <w:t xml:space="preserve">: Executive communications, stakeholder engagement and influence</w:t>
+        <w:jc w:val="both"/>
+        <w:rPr>
+          <w:rFonts w:ascii="Calibri" w:cs="Calibri" w:eastAsia="Calibri" w:hAnsi="Calibri"/>
+          <w:u w:val="none"/>
+        </w:rPr>
+      </w:pPr>
+      <w:r>
+        <w:rPr>
+          <w:rFonts w:ascii="Calibri" w:cs="Calibri" w:eastAsia="Calibri" w:hAnsi="Calibri"/>
+          <w:rtl w:val="0"/>
+        </w:rPr>
+        <w:t xml:space="preserve">Increased automation of routine tasks and performance metrics reporting by introducing AI aided tooling to create standardized dashboards and reports used by operations, technical, and leadership, thereby improving program communications and knowledge management</w:t>
+      </w:r>
+      <w:r>
+        <w:rPr>
+          <w:rtl w:val="0"/>
+        </w:rPr>
       </w:r>
     </w:p>
     <w:p>
@@ -600,136 +775,28 @@
           <w:ilvl w:val="0"/>
           <w:numId w:val="5"/>
         </w:numPr>
+        <w:tabs>
+          <w:tab w:val="right" w:leader="none" w:pos="9992"/>
+        </w:tabs>
         <w:spacing w:line="229" w:lineRule="auto"/>
         <w:ind w:left="0" w:right="-360" w:hanging="360"/>
-        <w:rPr>
-          <w:rFonts w:ascii="Calibri" w:cs="Calibri" w:eastAsia="Calibri" w:hAnsi="Calibri"/>
-        </w:rPr>
-      </w:pPr>
-      <w:r>
-        <w:rPr>
-          <w:rFonts w:ascii="Calibri" w:cs="Calibri" w:eastAsia="Calibri" w:hAnsi="Calibri"/>
-          <w:b w:val="1"/>
-          <w:bCs w:val="1"/>
-          <w:rtl w:val="0"/>
-        </w:rPr>
-        <w:t xml:space="preserve">Tools</w:t>
-      </w:r>
-      <w:r>
-        <w:rPr>
-          <w:rFonts w:ascii="Calibri" w:cs="Calibri" w:eastAsia="Calibri" w:hAnsi="Calibri"/>
-          <w:rtl w:val="0"/>
-        </w:rPr>
-        <w:t xml:space="preserve">: Google Workspace, Microsoft Office Suite, Asana, Airtable, Jira, AppScripts, Python, SQL, Markdown</w:t>
-      </w:r>
-    </w:p>
-    <w:p>
-      <w:pPr>
-        <w:spacing w:line="276" w:lineRule="auto"/>
-        <w:ind w:left="-360" w:right="-360" w:firstLine="0"/>
-        <w:rPr>
-          <w:rFonts w:ascii="Calibri" w:cs="Calibri" w:eastAsia="Calibri" w:hAnsi="Calibri"/>
-          <w:b w:val="1"/>
-          <w:bCs w:val="1"/>
-        </w:rPr>
-      </w:pPr>
-      <w:r>
-        <w:rPr>
-          <w:rtl w:val="0"/>
-        </w:rPr>
-      </w:r>
-    </w:p>
-    <w:p>
-      <w:pPr>
-        <w:spacing w:line="276" w:lineRule="auto"/>
-        <w:ind w:left="-360" w:right="-360" w:firstLine="0"/>
-        <w:jc w:val="center"/>
-        <w:rPr>
-          <w:rFonts w:ascii="Calibri" w:cs="Calibri" w:eastAsia="Calibri" w:hAnsi="Calibri"/>
-          <w:b w:val="1"/>
-          <w:bCs w:val="1"/>
-          <w:sz w:val="26"/>
-          <w:szCs w:val="26"/>
-        </w:rPr>
-      </w:pPr>
-      <w:r>
-        <w:rPr>
-          <w:rFonts w:ascii="Calibri" w:cs="Calibri" w:eastAsia="Calibri" w:hAnsi="Calibri"/>
-          <w:b w:val="1"/>
-          <w:bCs w:val="1"/>
-          <w:sz w:val="26"/>
-          <w:szCs w:val="26"/>
-          <w:rtl w:val="0"/>
-        </w:rPr>
-        <w:t xml:space="preserve">Experience</w:t>
-      </w:r>
-    </w:p>
-    <w:p>
-      <w:pPr>
-        <w:widowControl w:val="0"/>
-        <w:tabs>
-          <w:tab w:val="right" w:leader="none" w:pos="9992"/>
-        </w:tabs>
-        <w:spacing w:line="229" w:lineRule="auto"/>
-        <w:ind w:left="-360" w:right="-360" w:firstLine="0"/>
-        <w:jc w:val="both"/>
-        <w:rPr>
-          <w:rFonts w:ascii="Calibri" w:cs="Calibri" w:eastAsia="Calibri" w:hAnsi="Calibri"/>
-          <w:b w:val="1"/>
-          <w:bCs w:val="1"/>
-        </w:rPr>
-      </w:pPr>
-      <w:r>
-        <w:rPr>
-          <w:rFonts w:ascii="Calibri" w:cs="Calibri" w:eastAsia="Calibri" w:hAnsi="Calibri"/>
-          <w:b w:val="1"/>
-          <w:bCs w:val="1"/>
-          <w:rtl w:val="0"/>
-        </w:rPr>
-        <w:t xml:space="preserve">Meta RL - Eye Tracking</w:t>
-        <w:tab/>
-      </w:r>
-      <w:r>
-        <w:rPr>
-          <w:rFonts w:ascii="Calibri" w:cs="Calibri" w:eastAsia="Calibri" w:hAnsi="Calibri"/>
-          <w:rtl w:val="0"/>
-        </w:rPr>
-        <w:t xml:space="preserve">Redmond, WA</w:t>
-      </w:r>
-      <w:r>
-        <w:rPr>
-          <w:rtl w:val="0"/>
-        </w:rPr>
-      </w:r>
-    </w:p>
-    <w:p>
-      <w:pPr>
-        <w:widowControl w:val="0"/>
-        <w:tabs>
-          <w:tab w:val="right" w:leader="none" w:pos="9992"/>
-        </w:tabs>
-        <w:spacing w:line="229" w:lineRule="auto"/>
-        <w:ind w:left="-360" w:right="-360" w:firstLine="0"/>
-        <w:jc w:val="both"/>
-        <w:rPr>
-          <w:rFonts w:ascii="Calibri" w:cs="Calibri" w:eastAsia="Calibri" w:hAnsi="Calibri"/>
-        </w:rPr>
-      </w:pPr>
-      <w:r>
-        <w:rPr>
-          <w:rFonts w:ascii="Calibri" w:cs="Calibri" w:eastAsia="Calibri" w:hAnsi="Calibri"/>
-          <w:u w:val="single"/>
-          <w:rtl w:val="0"/>
-        </w:rPr>
-        <w:t xml:space="preserve">Technical Program Manager</w:t>
-      </w:r>
-      <w:r>
-        <w:rPr>
-          <w:rFonts w:ascii="Calibri" w:cs="Calibri" w:eastAsia="Calibri" w:hAnsi="Calibri"/>
-          <w:rtl w:val="0"/>
-        </w:rPr>
-        <w:tab/>
-        <w:t xml:space="preserve">October 2023 - Present</w:t>
+        <w:jc w:val="both"/>
+        <w:rPr>
+          <w:rFonts w:ascii="Calibri" w:cs="Calibri" w:eastAsia="Calibri" w:hAnsi="Calibri"/>
+          <w:u w:val="none"/>
+        </w:rPr>
+      </w:pPr>
+      <w:r>
+        <w:rPr>
+          <w:rFonts w:ascii="Calibri" w:cs="Calibri" w:eastAsia="Calibri" w:hAnsi="Calibri"/>
+          <w:rtl w:val="0"/>
+        </w:rPr>
+        <w:t xml:space="preserve">Drove vendor relationships, contract renewals, and budget tracking for key initiatives, ensuring all contractual milestones/agreements are met</w:t>
+      </w:r>
+      <w:r>
+        <w:rPr>
+          <w:rtl w:val="0"/>
+        </w:rPr>
       </w:r>
     </w:p>
     <w:p>
@@ -737,7 +804,7 @@
         <w:widowControl w:val="0"/>
         <w:numPr>
           <w:ilvl w:val="0"/>
-          <w:numId w:val="6"/>
+          <w:numId w:val="5"/>
         </w:numPr>
         <w:tabs>
           <w:tab w:val="right" w:leader="none" w:pos="9992"/>
@@ -755,189 +822,12 @@
           <w:rFonts w:ascii="Calibri" w:cs="Calibri" w:eastAsia="Calibri" w:hAnsi="Calibri"/>
           <w:rtl w:val="0"/>
         </w:rPr>
-        <w:t xml:space="preserve">Enhanced collaboration across SOW development and execution between BD, legal, internal technical DRIs, and external partners–improving SOW approval timelines from months to weeks</w:t>
-      </w:r>
-    </w:p>
-    <w:p>
-      <w:pPr>
-        <w:widowControl w:val="0"/>
-        <w:numPr>
-          <w:ilvl w:val="0"/>
-          <w:numId w:val="6"/>
-        </w:numPr>
-        <w:tabs>
-          <w:tab w:val="right" w:leader="none" w:pos="9992"/>
-        </w:tabs>
-        <w:spacing w:line="229" w:lineRule="auto"/>
-        <w:ind w:left="0" w:right="-360" w:hanging="360"/>
-        <w:jc w:val="both"/>
-        <w:rPr>
-          <w:rFonts w:ascii="Calibri" w:cs="Calibri" w:eastAsia="Calibri" w:hAnsi="Calibri"/>
-          <w:u w:val="none"/>
-        </w:rPr>
-      </w:pPr>
-      <w:r>
-        <w:rPr>
-          <w:rFonts w:ascii="Calibri" w:cs="Calibri" w:eastAsia="Calibri" w:hAnsi="Calibri"/>
-          <w:rtl w:val="0"/>
-        </w:rPr>
-        <w:t xml:space="preserve">Led strategic planning and execution for an average of 5-7 cross-functional programs annually, partnering with research, engineering, and operations to deliver on all fixed annual and quarterly priorities</w:t>
-      </w:r>
-    </w:p>
-    <w:p>
-      <w:pPr>
-        <w:widowControl w:val="0"/>
-        <w:numPr>
-          <w:ilvl w:val="0"/>
-          <w:numId w:val="6"/>
-        </w:numPr>
-        <w:tabs>
-          <w:tab w:val="right" w:leader="none" w:pos="9992"/>
-        </w:tabs>
-        <w:spacing w:line="229" w:lineRule="auto"/>
-        <w:ind w:left="0" w:right="-360" w:hanging="360"/>
-        <w:jc w:val="both"/>
-        <w:rPr>
-          <w:rFonts w:ascii="Calibri" w:cs="Calibri" w:eastAsia="Calibri" w:hAnsi="Calibri"/>
-          <w:u w:val="none"/>
-        </w:rPr>
-      </w:pPr>
-      <w:r>
-        <w:rPr>
-          <w:rFonts w:ascii="Calibri" w:cs="Calibri" w:eastAsia="Calibri" w:hAnsi="Calibri"/>
-          <w:rtl w:val="0"/>
-        </w:rPr>
-        <w:t xml:space="preserve">Spearheaded the development and projection of multi-million dollar budgets for annual planning, coordinating financial strategy and resource allocation across more than a dozen teams</w:t>
-      </w:r>
-    </w:p>
-    <w:p>
-      <w:pPr>
-        <w:widowControl w:val="0"/>
-        <w:numPr>
-          <w:ilvl w:val="0"/>
-          <w:numId w:val="6"/>
-        </w:numPr>
-        <w:tabs>
-          <w:tab w:val="right" w:leader="none" w:pos="9992"/>
-        </w:tabs>
-        <w:spacing w:line="229" w:lineRule="auto"/>
-        <w:ind w:left="0" w:right="-360" w:hanging="360"/>
-        <w:jc w:val="both"/>
-        <w:rPr>
-          <w:rFonts w:ascii="Calibri" w:cs="Calibri" w:eastAsia="Calibri" w:hAnsi="Calibri"/>
-          <w:u w:val="none"/>
-        </w:rPr>
-      </w:pPr>
-      <w:r>
-        <w:rPr>
-          <w:rFonts w:ascii="Calibri" w:cs="Calibri" w:eastAsia="Calibri" w:hAnsi="Calibri"/>
-          <w:rtl w:val="0"/>
-        </w:rPr>
-        <w:t xml:space="preserve">Delivered VR/AR prototype systems through design/requirements definitions and development throughout operational capture sessions at scale with external participants (dataset generation &gt;1,000)</w:t>
-      </w:r>
-    </w:p>
-    <w:p>
-      <w:pPr>
-        <w:widowControl w:val="0"/>
-        <w:numPr>
-          <w:ilvl w:val="0"/>
-          <w:numId w:val="6"/>
-        </w:numPr>
-        <w:tabs>
-          <w:tab w:val="right" w:leader="none" w:pos="9992"/>
-        </w:tabs>
-        <w:spacing w:line="229" w:lineRule="auto"/>
-        <w:ind w:left="0" w:right="-360" w:hanging="360"/>
-        <w:jc w:val="both"/>
-        <w:rPr>
-          <w:rFonts w:ascii="Calibri" w:cs="Calibri" w:eastAsia="Calibri" w:hAnsi="Calibri"/>
-          <w:u w:val="none"/>
-        </w:rPr>
-      </w:pPr>
-      <w:r>
-        <w:rPr>
-          <w:rFonts w:ascii="Calibri" w:cs="Calibri" w:eastAsia="Calibri" w:hAnsi="Calibri"/>
-          <w:rtl w:val="0"/>
-        </w:rPr>
-        <w:t xml:space="preserve">Managed a team of 5 direct reports and 4 floating reports (1 Human Studies Program Manager, 4-8 Research Assistants), overseeing resource allocation, onboarding, and professional development and improving team efficiency by &gt;20% by using automated and data-first approaches for individual coaching, identifying high-impact process improvement opportunities, and strategic resource allocations</w:t>
-      </w:r>
-    </w:p>
-    <w:p>
-      <w:pPr>
-        <w:widowControl w:val="0"/>
-        <w:numPr>
-          <w:ilvl w:val="0"/>
-          <w:numId w:val="6"/>
-        </w:numPr>
-        <w:tabs>
-          <w:tab w:val="right" w:leader="none" w:pos="9992"/>
-        </w:tabs>
-        <w:spacing w:line="229" w:lineRule="auto"/>
-        <w:ind w:left="0" w:right="-360" w:hanging="360"/>
-        <w:jc w:val="both"/>
-        <w:rPr>
-          <w:rFonts w:ascii="Calibri" w:cs="Calibri" w:eastAsia="Calibri" w:hAnsi="Calibri"/>
-          <w:u w:val="none"/>
-        </w:rPr>
-      </w:pPr>
-      <w:r>
-        <w:rPr>
-          <w:rFonts w:ascii="Calibri" w:cs="Calibri" w:eastAsia="Calibri" w:hAnsi="Calibri"/>
-          <w:rtl w:val="0"/>
-        </w:rPr>
-        <w:t xml:space="preserve">Increased automation of routine tasks and performance metrics reporting by introducing AI aided tooling to create standardized dashboards and reports used by operations, technical, and leadership, thereby improving program communications and knowledge management</w:t>
-      </w:r>
-    </w:p>
-    <w:p>
-      <w:pPr>
-        <w:widowControl w:val="0"/>
-        <w:numPr>
-          <w:ilvl w:val="0"/>
-          <w:numId w:val="6"/>
-        </w:numPr>
-        <w:tabs>
-          <w:tab w:val="right" w:leader="none" w:pos="9992"/>
-        </w:tabs>
-        <w:spacing w:line="229" w:lineRule="auto"/>
-        <w:ind w:left="0" w:right="-360" w:hanging="360"/>
-        <w:jc w:val="both"/>
-        <w:rPr>
-          <w:rFonts w:ascii="Calibri" w:cs="Calibri" w:eastAsia="Calibri" w:hAnsi="Calibri"/>
-          <w:u w:val="none"/>
-        </w:rPr>
-      </w:pPr>
-      <w:r>
-        <w:rPr>
-          <w:rFonts w:ascii="Calibri" w:cs="Calibri" w:eastAsia="Calibri" w:hAnsi="Calibri"/>
-          <w:rtl w:val="0"/>
-        </w:rPr>
-        <w:t xml:space="preserve">Drove vendor relationships, contract renewals, and budget tracking for key initiatives, ensuring all contractual milestones/agreements are met</w:t>
-      </w:r>
-    </w:p>
-    <w:p>
-      <w:pPr>
-        <w:widowControl w:val="0"/>
-        <w:numPr>
-          <w:ilvl w:val="0"/>
-          <w:numId w:val="6"/>
-        </w:numPr>
-        <w:tabs>
-          <w:tab w:val="right" w:leader="none" w:pos="9992"/>
-        </w:tabs>
-        <w:spacing w:line="229" w:lineRule="auto"/>
-        <w:ind w:left="0" w:right="-360" w:hanging="360"/>
-        <w:jc w:val="both"/>
-        <w:rPr>
-          <w:rFonts w:ascii="Calibri" w:cs="Calibri" w:eastAsia="Calibri" w:hAnsi="Calibri"/>
-          <w:u w:val="none"/>
-        </w:rPr>
-      </w:pPr>
-      <w:r>
-        <w:rPr>
-          <w:rFonts w:ascii="Calibri" w:cs="Calibri" w:eastAsia="Calibri" w:hAnsi="Calibri"/>
-          <w:rtl w:val="0"/>
-        </w:rPr>
         <w:t xml:space="preserve">Brought clarity across programs and engineering disciplines by introducing resource allocation mapping across 12+ programs spanning multiple organizations by introducing cross-organizational tracking of support allocations–leveraging individual contributor, engineering management, and program management input</w:t>
+      </w:r>
+      <w:r>
+        <w:rPr>
+          <w:rtl w:val="0"/>
+        </w:rPr>
       </w:r>
     </w:p>
     <w:p>
@@ -1045,7 +935,12 @@
           <w:rFonts w:ascii="Calibri" w:cs="Calibri" w:eastAsia="Calibri" w:hAnsi="Calibri"/>
           <w:rtl w:val="0"/>
         </w:rPr>
-        <w:t xml:space="preserve">Directed cross-functional teams in the modernization of technical infrastructure, emphasizing process optimization and clear technical communication.</w:t>
+        <w:t xml:space="preserve">Directed cross-functional teams in the modernization of technical infrastructure, emphasizing process optimization and clear technical communication</w:t>
+      </w:r>
+      <w:r>
+        <w:rPr>
+          <w:rtl w:val="0"/>
+        </w:rPr>
       </w:r>
     </w:p>
     <w:p>
@@ -1073,6 +968,11 @@
         </w:rPr>
         <w:t xml:space="preserve">Led the adoption of new technologies to automate and streamline business operations.</w:t>
       </w:r>
+      <w:r>
+        <w:rPr>
+          <w:rtl w:val="0"/>
+        </w:rPr>
+      </w:r>
     </w:p>
     <w:p>
       <w:pPr>
@@ -1097,7 +997,12 @@
           <w:rFonts w:ascii="Calibri" w:cs="Calibri" w:eastAsia="Calibri" w:hAnsi="Calibri"/>
           <w:rtl w:val="0"/>
         </w:rPr>
-        <w:t xml:space="preserve">Developed automated account monitoring software to ensure account balances and activities were easily and consistently tracked.</w:t>
+        <w:t xml:space="preserve">Developed automated account monitoring software to ensure account balances and activities were easily and consistently tracked</w:t>
+      </w:r>
+      <w:r>
+        <w:rPr>
+          <w:rtl w:val="0"/>
+        </w:rPr>
       </w:r>
     </w:p>
     <w:p>
@@ -1203,7 +1108,12 @@
           <w:rFonts w:ascii="Calibri" w:cs="Calibri" w:eastAsia="Calibri" w:hAnsi="Calibri"/>
           <w:rtl w:val="0"/>
         </w:rPr>
-        <w:t xml:space="preserve">Managed operational readiness and led organizational change during periods of ambiguity and staffing challenges.</w:t>
+        <w:t xml:space="preserve">Managed operational readiness and led organizational change during periods of ambiguity and staffing challenges</w:t>
+      </w:r>
+      <w:r>
+        <w:rPr>
+          <w:rtl w:val="0"/>
+        </w:rPr>
       </w:r>
     </w:p>
     <w:p>
@@ -1229,7 +1139,12 @@
           <w:rFonts w:ascii="Calibri" w:cs="Calibri" w:eastAsia="Calibri" w:hAnsi="Calibri"/>
           <w:rtl w:val="0"/>
         </w:rPr>
-        <w:t xml:space="preserve">Oversaw vendor relationships and contract management for critical system updates.</w:t>
+        <w:t xml:space="preserve">Oversaw vendor relationships and contract management for critical system updates</w:t>
+      </w:r>
+      <w:r>
+        <w:rPr>
+          <w:rtl w:val="0"/>
+        </w:rPr>
       </w:r>
     </w:p>
     <w:p>
@@ -1322,7 +1237,7 @@
           <w:tab w:val="right" w:leader="none" w:pos="9720"/>
         </w:tabs>
         <w:spacing w:line="229" w:lineRule="auto"/>
-        <w:ind w:right="-360" w:hanging="360"/>
+        <w:ind w:left="0" w:right="-360" w:hanging="360"/>
         <w:jc w:val="both"/>
         <w:rPr>
           <w:rFonts w:ascii="Calibri" w:cs="Calibri" w:eastAsia="Calibri" w:hAnsi="Calibri"/>
@@ -1347,7 +1262,7 @@
           <w:tab w:val="right" w:leader="none" w:pos="9720"/>
         </w:tabs>
         <w:spacing w:line="229" w:lineRule="auto"/>
-        <w:ind w:right="-360" w:hanging="360"/>
+        <w:ind w:left="0" w:right="-360" w:hanging="360"/>
         <w:jc w:val="both"/>
         <w:rPr>
           <w:rFonts w:ascii="Calibri" w:cs="Calibri" w:eastAsia="Calibri" w:hAnsi="Calibri"/>
@@ -1372,7 +1287,7 @@
           <w:tab w:val="right" w:leader="none" w:pos="9720"/>
         </w:tabs>
         <w:spacing w:line="229" w:lineRule="auto"/>
-        <w:ind w:right="-360" w:hanging="360"/>
+        <w:ind w:left="0" w:right="-360" w:hanging="360"/>
         <w:jc w:val="both"/>
         <w:rPr>
           <w:rFonts w:ascii="Calibri" w:cs="Calibri" w:eastAsia="Calibri" w:hAnsi="Calibri"/>
@@ -1397,7 +1312,7 @@
           <w:tab w:val="right" w:leader="none" w:pos="9720"/>
         </w:tabs>
         <w:spacing w:line="229" w:lineRule="auto"/>
-        <w:ind w:right="-360" w:hanging="360"/>
+        <w:ind w:left="0" w:right="-360" w:hanging="360"/>
         <w:jc w:val="both"/>
         <w:rPr>
           <w:rFonts w:ascii="Calibri" w:cs="Calibri" w:eastAsia="Calibri" w:hAnsi="Calibri"/>
@@ -1422,7 +1337,7 @@
           <w:tab w:val="right" w:leader="none" w:pos="9720"/>
         </w:tabs>
         <w:spacing w:line="229" w:lineRule="auto"/>
-        <w:ind w:right="-360" w:hanging="360"/>
+        <w:ind w:left="0" w:right="-360" w:hanging="360"/>
         <w:jc w:val="both"/>
         <w:rPr>
           <w:rFonts w:ascii="Calibri" w:cs="Calibri" w:eastAsia="Calibri" w:hAnsi="Calibri"/>
@@ -1447,7 +1362,7 @@
           <w:tab w:val="right" w:leader="none" w:pos="9720"/>
         </w:tabs>
         <w:spacing w:line="229" w:lineRule="auto"/>
-        <w:ind w:right="-360" w:hanging="360"/>
+        <w:ind w:left="0" w:right="-360" w:hanging="360"/>
         <w:jc w:val="both"/>
         <w:rPr>
           <w:rFonts w:ascii="Calibri" w:cs="Calibri" w:eastAsia="Calibri" w:hAnsi="Calibri"/>
@@ -1460,23 +1375,18 @@
         </w:rPr>
         <w:t xml:space="preserve">Optimized radar performance by identifying trends and improvement opportunities in flight data, implementing clutter improvement tasks, and briefing executives, military leadership, pilots, and all other stakeholders on system anomalies and workarounds that enabled successful Operational Assurance flights</w:t>
       </w:r>
-      <w:r>
-        <w:rPr>
-          <w:rtl w:val="0"/>
-        </w:rPr>
-      </w:r>
-    </w:p>
-    <w:p>
-      <w:pPr>
-        <w:spacing w:line="276" w:lineRule="auto"/>
-        <w:ind w:left="-360" w:right="-360" w:firstLine="0"/>
-        <w:jc w:val="center"/>
-        <w:rPr>
-          <w:rFonts w:ascii="Calibri" w:cs="Calibri" w:eastAsia="Calibri" w:hAnsi="Calibri"/>
-          <w:b w:val="1"/>
-          <w:bCs w:val="1"/>
-          <w:sz w:val="24"/>
-          <w:szCs w:val="24"/>
+    </w:p>
+    <w:p>
+      <w:pPr>
+        <w:widowControl w:val="0"/>
+        <w:tabs>
+          <w:tab w:val="right" w:leader="none" w:pos="9720"/>
+        </w:tabs>
+        <w:spacing w:line="229" w:lineRule="auto"/>
+        <w:ind w:right="-360"/>
+        <w:jc w:val="both"/>
+        <w:rPr>
+          <w:rFonts w:ascii="Calibri" w:cs="Calibri" w:eastAsia="Calibri" w:hAnsi="Calibri"/>
         </w:rPr>
       </w:pPr>
       <w:r>
@@ -1513,6 +1423,9 @@
     <w:p>
       <w:pPr>
         <w:widowControl w:val="0"/>
+        <w:tabs>
+          <w:tab w:val="right" w:leader="none" w:pos="9720"/>
+        </w:tabs>
         <w:spacing w:line="240" w:lineRule="auto"/>
         <w:ind w:left="-360" w:right="-360" w:firstLine="0"/>
         <w:rPr>
@@ -1533,56 +1446,33 @@
           <w:rFonts w:ascii="Calibri" w:cs="Calibri" w:eastAsia="Calibri" w:hAnsi="Calibri"/>
           <w:rtl w:val="0"/>
         </w:rPr>
-        <w:t xml:space="preserve">, Edinburg, Texas </w:t>
-      </w:r>
-    </w:p>
-    <w:p>
-      <w:pPr>
-        <w:widowControl w:val="0"/>
+        <w:t xml:space="preserve">, Edinburg, TX</w:t>
+      </w:r>
+    </w:p>
+    <w:p>
+      <w:pPr>
+        <w:widowControl w:val="0"/>
+        <w:tabs>
+          <w:tab w:val="right" w:leader="none" w:pos="9720"/>
+        </w:tabs>
         <w:spacing w:line="240" w:lineRule="auto"/>
         <w:ind w:left="-360" w:right="-360" w:firstLine="0"/>
         <w:rPr>
           <w:rFonts w:ascii="Calibri" w:cs="Calibri" w:eastAsia="Calibri" w:hAnsi="Calibri"/>
-        </w:rPr>
-      </w:pPr>
-      <w:r>
-        <w:rPr>
-          <w:rFonts w:ascii="Calibri" w:cs="Calibri" w:eastAsia="Calibri" w:hAnsi="Calibri"/>
           <w:u w:val="single"/>
+        </w:rPr>
+      </w:pPr>
+      <w:r>
+        <w:rPr>
+          <w:rFonts w:ascii="Calibri" w:cs="Calibri" w:eastAsia="Calibri" w:hAnsi="Calibri"/>
+          <w:u w:val="single"/>
           <w:rtl w:val="0"/>
         </w:rPr>
         <w:t xml:space="preserve">Bachelor of Science in Electrical Engineering</w:t>
       </w:r>
-      <w:r>
-        <w:rPr>
-          <w:rFonts w:ascii="Calibri" w:cs="Calibri" w:eastAsia="Calibri" w:hAnsi="Calibri"/>
-          <w:rtl w:val="0"/>
-        </w:rPr>
-        <w:t xml:space="preserve"> </w:t>
-      </w:r>
-    </w:p>
-    <w:p>
-      <w:pPr>
-        <w:widowControl w:val="0"/>
-        <w:spacing w:line="240" w:lineRule="auto"/>
-        <w:ind w:left="-360" w:right="-360" w:firstLine="0"/>
-        <w:rPr/>
-      </w:pPr>
-      <w:r>
-        <w:rPr>
-          <w:rFonts w:ascii="Calibri" w:cs="Calibri" w:eastAsia="Calibri" w:hAnsi="Calibri"/>
-          <w:rtl w:val="0"/>
-        </w:rPr>
-        <w:t xml:space="preserve">Graduation Date: May 2011</w:t>
-      </w:r>
-      <w:r>
-        <w:rPr>
-          <w:rtl w:val="0"/>
-        </w:rPr>
-      </w:r>
     </w:p>
     <w:sectPr>
-      <w:headerReference r:id="rId6" w:type="default"/>
+      <w:headerReference r:id="rId7" w:type="default"/>
       <w:pgSz w:h="15840" w:w="12240" w:orient="portrait"/>
       <w:pgMar w:bottom="1440" w:top="810" w:left="1440" w:right="1440" w:header="360" w:footer="720"/>
       <w:pgNumType w:start="1"/>
@@ -2158,116 +2048,6 @@
       </w:rPr>
     </w:lvl>
   </w:abstractNum>
-  <w:abstractNum w:abstractNumId="6">
-    <w:lvl w:ilvl="0">
-      <w:start w:val="1"/>
-      <w:numFmt w:val="bullet"/>
-      <w:lvlText w:val="●"/>
-      <w:lvlJc w:val="left"/>
-      <w:pPr>
-        <w:ind w:left="0" w:hanging="360"/>
-      </w:pPr>
-      <w:rPr>
-        <w:u w:val="none"/>
-      </w:rPr>
-    </w:lvl>
-    <w:lvl w:ilvl="1">
-      <w:start w:val="1"/>
-      <w:numFmt w:val="bullet"/>
-      <w:lvlText w:val="○"/>
-      <w:lvlJc w:val="left"/>
-      <w:pPr>
-        <w:ind w:left="1440" w:hanging="360"/>
-      </w:pPr>
-      <w:rPr>
-        <w:u w:val="none"/>
-      </w:rPr>
-    </w:lvl>
-    <w:lvl w:ilvl="2">
-      <w:start w:val="1"/>
-      <w:numFmt w:val="bullet"/>
-      <w:lvlText w:val="■"/>
-      <w:lvlJc w:val="left"/>
-      <w:pPr>
-        <w:ind w:left="2160" w:hanging="360"/>
-      </w:pPr>
-      <w:rPr>
-        <w:u w:val="none"/>
-      </w:rPr>
-    </w:lvl>
-    <w:lvl w:ilvl="3">
-      <w:start w:val="1"/>
-      <w:numFmt w:val="bullet"/>
-      <w:lvlText w:val="●"/>
-      <w:lvlJc w:val="left"/>
-      <w:pPr>
-        <w:ind w:left="2880" w:hanging="360"/>
-      </w:pPr>
-      <w:rPr>
-        <w:u w:val="none"/>
-      </w:rPr>
-    </w:lvl>
-    <w:lvl w:ilvl="4">
-      <w:start w:val="1"/>
-      <w:numFmt w:val="bullet"/>
-      <w:lvlText w:val="○"/>
-      <w:lvlJc w:val="left"/>
-      <w:pPr>
-        <w:ind w:left="3600" w:hanging="360"/>
-      </w:pPr>
-      <w:rPr>
-        <w:u w:val="none"/>
-      </w:rPr>
-    </w:lvl>
-    <w:lvl w:ilvl="5">
-      <w:start w:val="1"/>
-      <w:numFmt w:val="bullet"/>
-      <w:lvlText w:val="■"/>
-      <w:lvlJc w:val="left"/>
-      <w:pPr>
-        <w:ind w:left="4320" w:hanging="360"/>
-      </w:pPr>
-      <w:rPr>
-        <w:u w:val="none"/>
-      </w:rPr>
-    </w:lvl>
-    <w:lvl w:ilvl="6">
-      <w:start w:val="1"/>
-      <w:numFmt w:val="bullet"/>
-      <w:lvlText w:val="●"/>
-      <w:lvlJc w:val="left"/>
-      <w:pPr>
-        <w:ind w:left="5040" w:hanging="360"/>
-      </w:pPr>
-      <w:rPr>
-        <w:u w:val="none"/>
-      </w:rPr>
-    </w:lvl>
-    <w:lvl w:ilvl="7">
-      <w:start w:val="1"/>
-      <w:numFmt w:val="bullet"/>
-      <w:lvlText w:val="○"/>
-      <w:lvlJc w:val="left"/>
-      <w:pPr>
-        <w:ind w:left="5760" w:hanging="360"/>
-      </w:pPr>
-      <w:rPr>
-        <w:u w:val="none"/>
-      </w:rPr>
-    </w:lvl>
-    <w:lvl w:ilvl="8">
-      <w:start w:val="1"/>
-      <w:numFmt w:val="bullet"/>
-      <w:lvlText w:val="■"/>
-      <w:lvlJc w:val="left"/>
-      <w:pPr>
-        <w:ind w:left="6480" w:hanging="360"/>
-      </w:pPr>
-      <w:rPr>
-        <w:u w:val="none"/>
-      </w:rPr>
-    </w:lvl>
-  </w:abstractNum>
   <w:num w:numId="1">
     <w:abstractNumId w:val="1"/>
   </w:num>
@@ -2282,9 +2062,6 @@
   </w:num>
   <w:num w:numId="5">
     <w:abstractNumId w:val="5"/>
-  </w:num>
-  <w:num w:numId="6">
-    <w:abstractNumId w:val="6"/>
   </w:num>
 </w:numbering>
 </file>
@@ -2434,6 +2211,34 @@
       <w:sz w:val="52"/>
       <w:szCs w:val="52"/>
     </w:rPr>
+  </w:style>
+  <w:style w:type="table" w:styleId="TableNormal" w:default="1">
+    <w:name w:val="TableNormal"/>
+    <w:tblPr>
+      <w:tblCellMar>
+        <w:top w:w="100.0" w:type="dxa"/>
+        <w:left w:w="100.0" w:type="dxa"/>
+        <w:bottom w:w="100.0" w:type="dxa"/>
+        <w:right w:w="100.0" w:type="dxa"/>
+      </w:tblCellMar>
+    </w:tblPr>
+  </w:style>
+  <w:style w:type="paragraph" w:styleId="Normal" w:default="1">
+    <w:name w:val="normal"/>
+  </w:style>
+  <w:style w:type="table" w:styleId="TableNormal" w:default="1">
+    <w:name w:val="TableNormal"/>
+    <w:tblPr>
+      <w:tblCellMar>
+        <w:top w:w="100.0" w:type="dxa"/>
+        <w:left w:w="100.0" w:type="dxa"/>
+        <w:bottom w:w="100.0" w:type="dxa"/>
+        <w:right w:w="100.0" w:type="dxa"/>
+      </w:tblCellMar>
+    </w:tblPr>
+  </w:style>
+  <w:style w:type="paragraph" w:styleId="Normal" w:default="1">
+    <w:name w:val="normal"/>
   </w:style>
   <w:style w:type="paragraph" w:styleId="Subtitle">
     <w:name w:val="Subtitle"/>
@@ -2775,4 +2580,19 @@
   </a:objectDefaults>
   <a:extraClrSchemeLst/>
 </a:theme>
+</file>
+
+<file path=customXML/item1.xml><?xml version="1.0" encoding="utf-8"?>
+<go:gDocsCustomXmlDataStorage xmlns:go="http://customooxmlschemas.google.com/" xmlns:r="http://schemas.openxmlformats.org/officeDocument/2006/relationships" uri="GoogleDocsCustomDataVersion2">
+  <go:docsCustomData xmlns:go="http://customooxmlschemas.google.com/" roundtripDataSignature="AMtx7miVDioMGdDR7mlCUtGfIgLCI6/HFw==">CgMxLjA4AHIhMTN0aWRGZUozOWN4c01tejZIU3pIVGctemRiR1laZWVK</go:docsCustomData>
+</go:gDocsCustomXmlDataStorage>
+</file>
+
+<file path=customXML/itemProps1.xml><?xml version="1.0" encoding="utf-8"?>
+<ds:datastoreItem xmlns:ds="http://schemas.openxmlformats.org/officeDocument/2006/customXml" ds:itemID="{11111111-1234-1234-1234-123412341234}">
+  <ds:schemaRefs>
+    <ds:schemaRef ds:uri="http://schemas.openxmlformats.org/officeDocument/2006/relationships"/>
+    <ds:schemaRef ds:uri="http://customooxmlschemas.google.com/"/>
+  </ds:schemaRefs>
+</ds:datastoreItem>
 </file>
</xml_diff>